<commit_message>
fix: corrige tutorial extra do NRZ-L
</commit_message>
<xml_diff>
--- a/nrz_l/extras/pmod_osciloscopio/docs/tutorial.docx
+++ b/nrz_l/extras/pmod_osciloscopio/docs/tutorial.docx
@@ -491,6 +491,12 @@
         <w:rPr>
           <w:rFonts w:ascii="Arial" w:hAnsi="Arial" w:cs="Arial"/>
         </w:rPr>
+        <w:t xml:space="preserve"> do modulador NRZ-L</w:t>
+      </w:r>
+      <w:r>
+        <w:rPr>
+          <w:rFonts w:ascii="Arial" w:hAnsi="Arial" w:cs="Arial"/>
+        </w:rPr>
         <w:t xml:space="preserve"> </w:t>
       </w:r>
       <w:r>
@@ -556,6 +562,12 @@
         <w:rPr>
           <w:rFonts w:ascii="Arial" w:hAnsi="Arial" w:cs="Arial"/>
         </w:rPr>
+        <w:t xml:space="preserve">do modulador NRZ-L, </w:t>
+      </w:r>
+      <w:r>
+        <w:rPr>
+          <w:rFonts w:ascii="Arial" w:hAnsi="Arial" w:cs="Arial"/>
+        </w:rPr>
         <w:t>para simulação com osciloscópio (disponíveis no repositório)</w:t>
       </w:r>
     </w:p>
@@ -708,6 +720,7 @@
       <w:r>
         <w:rPr>
           <w:rFonts w:ascii="Arial" w:hAnsi="Arial" w:cs="Arial"/>
+          <w:noProof/>
         </w:rPr>
         <w:drawing>
           <wp:inline distT="0" distB="0" distL="0" distR="0" wp14:anchorId="1EF7B229" wp14:editId="53CC9F7F">
@@ -754,6 +767,7 @@
       <w:r>
         <w:rPr>
           <w:rFonts w:ascii="Arial" w:hAnsi="Arial" w:cs="Arial"/>
+          <w:noProof/>
         </w:rPr>
         <w:drawing>
           <wp:inline distT="0" distB="0" distL="0" distR="0" wp14:anchorId="4E5715BA" wp14:editId="1B988E8E">
@@ -835,19 +849,7 @@
         <w:rPr>
           <w:rFonts w:ascii="Arial" w:hAnsi="Arial" w:cs="Arial"/>
         </w:rPr>
-        <w:t xml:space="preserve">Em seguida, </w:t>
-      </w:r>
-      <w:r>
-        <w:rPr>
-          <w:rFonts w:ascii="Arial" w:hAnsi="Arial" w:cs="Arial"/>
-        </w:rPr>
-        <w:t>localize o arquivo d</w:t>
-      </w:r>
-      <w:r>
-        <w:rPr>
-          <w:rFonts w:ascii="Arial" w:hAnsi="Arial" w:cs="Arial"/>
-        </w:rPr>
-        <w:t xml:space="preserve">e </w:t>
+        <w:t xml:space="preserve">Em seguida, localize o arquivo de </w:t>
       </w:r>
       <w:proofErr w:type="spellStart"/>
       <w:r>
@@ -861,13 +863,7 @@
         <w:rPr>
           <w:rFonts w:ascii="Arial" w:hAnsi="Arial" w:cs="Arial"/>
         </w:rPr>
-        <w:t xml:space="preserve"> </w:t>
-      </w:r>
-      <w:r>
-        <w:rPr>
-          <w:rFonts w:ascii="Arial" w:hAnsi="Arial" w:cs="Arial"/>
-        </w:rPr>
-        <w:t>e substitua o conteúdo com o código do arquivo que está na pasta “</w:t>
+        <w:t xml:space="preserve"> e substitua o conteúdo com o código do arquivo que está na pasta “</w:t>
       </w:r>
       <w:proofErr w:type="spellStart"/>
       <w:r>
@@ -908,6 +904,7 @@
       <w:r>
         <w:rPr>
           <w:rFonts w:ascii="Arial" w:hAnsi="Arial" w:cs="Arial"/>
+          <w:noProof/>
         </w:rPr>
         <w:lastRenderedPageBreak/>
         <w:drawing>
@@ -957,6 +954,7 @@
       <w:r>
         <w:rPr>
           <w:rFonts w:ascii="Arial" w:hAnsi="Arial" w:cs="Arial"/>
+          <w:noProof/>
         </w:rPr>
         <w:drawing>
           <wp:inline distT="0" distB="0" distL="0" distR="0" wp14:anchorId="1B33A920" wp14:editId="0C9CAC6B">
@@ -1003,6 +1001,7 @@
       <w:r>
         <w:rPr>
           <w:rFonts w:ascii="Arial" w:hAnsi="Arial" w:cs="Arial"/>
+          <w:noProof/>
         </w:rPr>
         <w:drawing>
           <wp:inline distT="0" distB="0" distL="0" distR="0" wp14:anchorId="7503F291" wp14:editId="790F0265">
@@ -1941,6 +1940,7 @@
       <w:r>
         <w:rPr>
           <w:rFonts w:ascii="Arial" w:hAnsi="Arial" w:cs="Arial"/>
+          <w:noProof/>
         </w:rPr>
         <w:drawing>
           <wp:inline distT="0" distB="0" distL="0" distR="0" wp14:anchorId="5381F6D5" wp14:editId="09BD1A0D">
@@ -2046,6 +2046,7 @@
       <w:r>
         <w:rPr>
           <w:rFonts w:ascii="Arial" w:hAnsi="Arial" w:cs="Arial"/>
+          <w:noProof/>
         </w:rPr>
         <w:drawing>
           <wp:inline distT="0" distB="0" distL="0" distR="0" wp14:anchorId="130FB769" wp14:editId="0B060117">
@@ -2123,6 +2124,9 @@
         <w:jc w:val="center"/>
       </w:pPr>
       <w:r>
+        <w:rPr>
+          <w:noProof/>
+        </w:rPr>
         <w:lastRenderedPageBreak/>
         <w:drawing>
           <wp:inline distT="0" distB="0" distL="0" distR="0" wp14:anchorId="31CA447D" wp14:editId="28CD9CFB">
@@ -2311,6 +2315,9 @@
         <w:jc w:val="center"/>
       </w:pPr>
       <w:r>
+        <w:rPr>
+          <w:noProof/>
+        </w:rPr>
         <w:lastRenderedPageBreak/>
         <w:drawing>
           <wp:inline distT="0" distB="0" distL="0" distR="0" wp14:anchorId="43DF30A5" wp14:editId="47CE5F86">
@@ -2385,6 +2392,9 @@
         <w:jc w:val="center"/>
       </w:pPr>
       <w:r>
+        <w:rPr>
+          <w:noProof/>
+        </w:rPr>
         <w:drawing>
           <wp:inline distT="0" distB="0" distL="0" distR="0" wp14:anchorId="559B3720" wp14:editId="2D40D215">
             <wp:extent cx="3336186" cy="1096108"/>
@@ -2920,25 +2930,7 @@
         <w:rPr>
           <w:rFonts w:ascii="Arial" w:hAnsi="Arial" w:cs="Arial"/>
         </w:rPr>
-        <w:t xml:space="preserve">, sendo </w:t>
-      </w:r>
-      <w:r>
-        <w:rPr>
-          <w:rFonts w:ascii="Arial" w:hAnsi="Arial" w:cs="Arial"/>
-        </w:rPr>
-        <w:t>os bits mais significativos</w:t>
-      </w:r>
-      <w:r>
-        <w:rPr>
-          <w:rFonts w:ascii="Arial" w:hAnsi="Arial" w:cs="Arial"/>
-        </w:rPr>
-        <w:t xml:space="preserve"> </w:t>
-      </w:r>
-      <w:r>
-        <w:rPr>
-          <w:rFonts w:ascii="Arial" w:hAnsi="Arial" w:cs="Arial"/>
-        </w:rPr>
-        <w:t>à esquerda e os menos significativos à direita.</w:t>
+        <w:t>, sendo os bits mais significativos à esquerda e os menos significativos à direita.</w:t>
       </w:r>
       <w:r>
         <w:rPr>
@@ -3070,13 +3062,7 @@
           <w:rFonts w:ascii="Arial" w:hAnsi="Arial" w:cs="Arial"/>
         </w:rPr>
         <w:lastRenderedPageBreak/>
-        <w:t xml:space="preserve">switches para representar a sequência </w:t>
-      </w:r>
-      <w:r>
-        <w:rPr>
-          <w:rFonts w:ascii="Arial" w:hAnsi="Arial" w:cs="Arial"/>
-        </w:rPr>
-        <w:t>“</w:t>
+        <w:t>switches para representar a sequência “</w:t>
       </w:r>
       <w:r>
         <w:rPr>
@@ -3088,13 +3074,7 @@
         <w:rPr>
           <w:rFonts w:ascii="Arial" w:hAnsi="Arial" w:cs="Arial"/>
         </w:rPr>
-        <w:t>” (bit 1 = switch para cima; bit 0 = switch para baixo)</w:t>
-      </w:r>
-      <w:r>
-        <w:rPr>
-          <w:rFonts w:ascii="Arial" w:hAnsi="Arial" w:cs="Arial"/>
-        </w:rPr>
-        <w:t>.</w:t>
+        <w:t>” (bit 1 = switch para cima; bit 0 = switch para baixo).</w:t>
       </w:r>
     </w:p>
     <w:p>
@@ -3174,6 +3154,7 @@
           <w:rFonts w:ascii="Arial" w:hAnsi="Arial" w:cs="Arial"/>
           <w:b/>
           <w:bCs/>
+          <w:noProof/>
           <w:sz w:val="28"/>
           <w:szCs w:val="28"/>
         </w:rPr>
@@ -3264,6 +3245,7 @@
       <w:r>
         <w:rPr>
           <w:rFonts w:ascii="Arial" w:hAnsi="Arial" w:cs="Arial"/>
+          <w:noProof/>
         </w:rPr>
         <w:drawing>
           <wp:inline distT="0" distB="0" distL="0" distR="0" wp14:anchorId="08C7FFAE" wp14:editId="28A8DAF1">
@@ -3390,6 +3372,9 @@
         <w:ind w:firstLine="567"/>
       </w:pPr>
       <w:r>
+        <w:rPr>
+          <w:noProof/>
+        </w:rPr>
         <w:drawing>
           <wp:inline distT="0" distB="0" distL="0" distR="0" wp14:anchorId="05079999" wp14:editId="24787EF4">
             <wp:extent cx="5400040" cy="2821305"/>

</xml_diff>